<commit_message>
Improve proposal Word export with GFM tables and AU payment options.
Render markdown tables as native Word tables via subdoc, add payment_options context for au-advisory, and document template placeholders across sg-incorp, harneys-bvi, and au-advisory.

Co-authored-by: Cursor <cursoragent@cursor.com>
</commit_message>
<xml_diff>
--- a/backend/agents/proposal-composer/knowledge/templates/harneys-bvi/export/proposal.docx
+++ b/backend/agents/proposal-composer/knowledge/templates/harneys-bvi/export/proposal.docx
@@ -46,13 +46,7 @@
     </w:p>
     <w:p/>
     <w:p/>
-    <w:p>
-      <w:pPr>
-        <w:rPr>
-          <w:rFonts w:hint="eastAsia"/>
-        </w:rPr>
-      </w:pPr>
-    </w:p>
+    <w:p/>
     <w:p/>
     <w:p>
       <w:pPr>
@@ -186,20 +180,8 @@
       </w:r>
     </w:p>
     <w:p/>
-    <w:p>
-      <w:pPr>
-        <w:rPr>
-          <w:rFonts w:hint="eastAsia"/>
-        </w:rPr>
-      </w:pPr>
-    </w:p>
-    <w:p>
-      <w:pPr>
-        <w:rPr>
-          <w:rFonts w:hint="eastAsia"/>
-        </w:rPr>
-      </w:pPr>
-    </w:p>
+    <w:p/>
+    <w:p/>
     <w:p>
       <w:pPr>
         <w:widowControl/>
@@ -253,13 +235,7 @@
         <w:t>}</w:t>
       </w:r>
     </w:p>
-    <w:p>
-      <w:pPr>
-        <w:rPr>
-          <w:rFonts w:hint="eastAsia"/>
-        </w:rPr>
-      </w:pPr>
-    </w:p>
+    <w:p/>
     <w:p>
       <w:r>
         <w:rPr>
@@ -1161,52 +1137,22 @@
           <w:rFonts w:ascii="Roboto" w:hAnsi="Roboto"/>
         </w:rPr>
         <w:lastRenderedPageBreak/>
-        <w:t xml:space="preserve">{% endif </w:t>
-      </w:r>
-      <w:proofErr w:type="gramStart"/>
-      <w:r>
-        <w:rPr>
-          <w:rFonts w:ascii="Roboto" w:hAnsi="Roboto"/>
-        </w:rPr>
-        <w:t>%}</w:t>
-      </w:r>
-      <w:r>
-        <w:rPr>
-          <w:rFonts w:ascii="Roboto" w:hAnsi="Roboto"/>
-        </w:rPr>
-        <w:t>{</w:t>
-      </w:r>
-      <w:proofErr w:type="gramEnd"/>
-      <w:r>
-        <w:rPr>
-          <w:rFonts w:ascii="Roboto" w:hAnsi="Roboto"/>
-        </w:rPr>
-        <w:t xml:space="preserve">% if </w:t>
+        <w:t>{% endif %}</w:t>
+      </w:r>
+      <w:r>
+        <w:rPr>
+          <w:rFonts w:ascii="Roboto" w:hAnsi="Roboto"/>
+        </w:rPr>
+        <w:t xml:space="preserve">{% if </w:t>
       </w:r>
       <w:proofErr w:type="spellStart"/>
-      <w:proofErr w:type="gramStart"/>
-      <w:r>
-        <w:rPr>
-          <w:rFonts w:ascii="Roboto" w:hAnsi="Roboto"/>
-        </w:rPr>
-        <w:t>sections.required</w:t>
-      </w:r>
-      <w:proofErr w:type="gramEnd"/>
-      <w:r>
-        <w:rPr>
-          <w:rFonts w:ascii="Roboto" w:hAnsi="Roboto"/>
-        </w:rPr>
-        <w:t>_</w:t>
-      </w:r>
-      <w:proofErr w:type="gramStart"/>
-      <w:r>
-        <w:rPr>
-          <w:rFonts w:ascii="Roboto" w:hAnsi="Roboto"/>
-        </w:rPr>
-        <w:t>documents.enabled</w:t>
+      <w:r>
+        <w:rPr>
+          <w:rFonts w:ascii="Roboto" w:hAnsi="Roboto"/>
+        </w:rPr>
+        <w:t>sections.required_documents.enabled</w:t>
       </w:r>
       <w:proofErr w:type="spellEnd"/>
-      <w:proofErr w:type="gramEnd"/>
       <w:r>
         <w:rPr>
           <w:rFonts w:ascii="Roboto" w:hAnsi="Roboto"/>
@@ -1231,14 +1177,7 @@
         <w:rPr>
           <w:rFonts w:ascii="Roboto" w:hAnsi="Roboto"/>
         </w:rPr>
-        <w:t xml:space="preserve"> </w:t>
-      </w:r>
-      <w:proofErr w:type="gramStart"/>
-      <w:r>
-        <w:rPr>
-          <w:rFonts w:ascii="Roboto" w:hAnsi="Roboto"/>
-        </w:rPr>
-        <w:t>%}</w:t>
+        <w:t xml:space="preserve"> %}</w:t>
       </w:r>
       <w:r>
         <w:rPr>
@@ -1251,9 +1190,9 @@
           <w:szCs w:val="28"/>
           <w14:ligatures w14:val="none"/>
         </w:rPr>
-        <w:t>Required</w:t>
-      </w:r>
-      <w:proofErr w:type="gramEnd"/>
+        <w:t xml:space="preserve">{{ </w:t>
+      </w:r>
+      <w:proofErr w:type="spellStart"/>
       <w:r>
         <w:rPr>
           <w:rFonts w:ascii="Menlo" w:eastAsia="宋体" w:hAnsi="Menlo" w:cs="Menlo"/>
@@ -1265,233 +1204,9 @@
           <w:szCs w:val="28"/>
           <w14:ligatures w14:val="none"/>
         </w:rPr>
-        <w:t xml:space="preserve"> Document</w:t>
-      </w:r>
-    </w:p>
-    <w:p>
-      <w:pPr>
-        <w:widowControl/>
-        <w:jc w:val="left"/>
-        <w:rPr>
-          <w:rFonts w:ascii="Roboto" w:hAnsi="Roboto"/>
-        </w:rPr>
-      </w:pPr>
-    </w:p>
-    <w:p>
-      <w:pPr>
-        <w:widowControl/>
-        <w:jc w:val="left"/>
-        <w:rPr>
-          <w:rFonts w:ascii="Roboto" w:hAnsi="Roboto"/>
-          <w:b/>
-          <w:bCs/>
-          <w:sz w:val="24"/>
-        </w:rPr>
-      </w:pPr>
-      <w:proofErr w:type="gramStart"/>
-      <w:r>
-        <w:rPr>
-          <w:rFonts w:ascii="Roboto" w:hAnsi="Roboto"/>
-          <w:b/>
-          <w:bCs/>
-          <w:sz w:val="24"/>
-        </w:rPr>
-        <w:t xml:space="preserve">{{ </w:t>
-      </w:r>
-      <w:proofErr w:type="spellStart"/>
-      <w:r>
-        <w:rPr>
-          <w:rFonts w:ascii="Roboto" w:hAnsi="Roboto"/>
-          <w:b/>
-          <w:bCs/>
-          <w:sz w:val="24"/>
-        </w:rPr>
-        <w:t>sections</w:t>
-      </w:r>
-      <w:proofErr w:type="gramEnd"/>
-      <w:r>
-        <w:rPr>
-          <w:rFonts w:ascii="Roboto" w:hAnsi="Roboto"/>
-          <w:b/>
-          <w:bCs/>
-          <w:sz w:val="24"/>
-        </w:rPr>
-        <w:t>.required_</w:t>
-      </w:r>
-      <w:proofErr w:type="gramStart"/>
-      <w:r>
-        <w:rPr>
-          <w:rFonts w:ascii="Roboto" w:hAnsi="Roboto"/>
-          <w:b/>
-          <w:bCs/>
-          <w:sz w:val="24"/>
-        </w:rPr>
-        <w:t>documents.title</w:t>
+        <w:t>sections.required_documents.title</w:t>
       </w:r>
       <w:proofErr w:type="spellEnd"/>
-      <w:proofErr w:type="gramEnd"/>
-      <w:r>
-        <w:rPr>
-          <w:rFonts w:ascii="Roboto" w:hAnsi="Roboto"/>
-          <w:b/>
-          <w:bCs/>
-          <w:sz w:val="24"/>
-        </w:rPr>
-        <w:t xml:space="preserve"> }}</w:t>
-      </w:r>
-    </w:p>
-    <w:p>
-      <w:pPr>
-        <w:widowControl/>
-        <w:jc w:val="left"/>
-        <w:rPr>
-          <w:rFonts w:ascii="Roboto" w:hAnsi="Roboto"/>
-        </w:rPr>
-      </w:pPr>
-      <w:proofErr w:type="gramStart"/>
-      <w:r>
-        <w:rPr>
-          <w:rFonts w:ascii="Roboto" w:hAnsi="Roboto"/>
-        </w:rPr>
-        <w:t xml:space="preserve">{{ </w:t>
-      </w:r>
-      <w:proofErr w:type="spellStart"/>
-      <w:r>
-        <w:rPr>
-          <w:rFonts w:ascii="Roboto" w:hAnsi="Roboto"/>
-        </w:rPr>
-        <w:t>sections</w:t>
-      </w:r>
-      <w:proofErr w:type="gramEnd"/>
-      <w:r>
-        <w:rPr>
-          <w:rFonts w:ascii="Roboto" w:hAnsi="Roboto"/>
-        </w:rPr>
-        <w:t>.required_</w:t>
-      </w:r>
-      <w:proofErr w:type="gramStart"/>
-      <w:r>
-        <w:rPr>
-          <w:rFonts w:ascii="Roboto" w:hAnsi="Roboto"/>
-        </w:rPr>
-        <w:t>documents</w:t>
-      </w:r>
-      <w:proofErr w:type="spellEnd"/>
-      <w:r>
-        <w:rPr>
-          <w:rFonts w:ascii="Roboto" w:hAnsi="Roboto"/>
-        </w:rPr>
-        <w:t xml:space="preserve"> }</w:t>
-      </w:r>
-      <w:proofErr w:type="gramEnd"/>
-      <w:r>
-        <w:rPr>
-          <w:rFonts w:ascii="Roboto" w:hAnsi="Roboto"/>
-        </w:rPr>
-        <w:t>}</w:t>
-      </w:r>
-    </w:p>
-    <w:p>
-      <w:pPr>
-        <w:widowControl/>
-        <w:jc w:val="left"/>
-        <w:rPr>
-          <w:rFonts w:ascii="Roboto" w:hAnsi="Roboto"/>
-        </w:rPr>
-      </w:pPr>
-      <w:r>
-        <w:rPr>
-          <w:rFonts w:ascii="Roboto" w:hAnsi="Roboto"/>
-        </w:rPr>
-        <w:br w:type="page"/>
-      </w:r>
-    </w:p>
-    <w:p>
-      <w:pPr>
-        <w:widowControl/>
-        <w:jc w:val="left"/>
-        <w:rPr>
-          <w:rFonts w:ascii="Roboto" w:hAnsi="Roboto"/>
-        </w:rPr>
-      </w:pPr>
-      <w:r>
-        <w:rPr>
-          <w:rFonts w:ascii="Roboto" w:hAnsi="Roboto"/>
-        </w:rPr>
-        <w:lastRenderedPageBreak/>
-        <w:t xml:space="preserve">{% endif </w:t>
-      </w:r>
-      <w:proofErr w:type="gramStart"/>
-      <w:r>
-        <w:rPr>
-          <w:rFonts w:ascii="Roboto" w:hAnsi="Roboto"/>
-        </w:rPr>
-        <w:t>%}</w:t>
-      </w:r>
-      <w:r>
-        <w:rPr>
-          <w:rFonts w:ascii="Roboto" w:hAnsi="Roboto"/>
-        </w:rPr>
-        <w:t>{</w:t>
-      </w:r>
-      <w:proofErr w:type="gramEnd"/>
-      <w:r>
-        <w:rPr>
-          <w:rFonts w:ascii="Roboto" w:hAnsi="Roboto"/>
-        </w:rPr>
-        <w:t xml:space="preserve">% if </w:t>
-      </w:r>
-      <w:proofErr w:type="spellStart"/>
-      <w:proofErr w:type="gramStart"/>
-      <w:r>
-        <w:rPr>
-          <w:rFonts w:ascii="Roboto" w:hAnsi="Roboto"/>
-        </w:rPr>
-        <w:t>sections.appendices</w:t>
-      </w:r>
-      <w:proofErr w:type="gramEnd"/>
-      <w:r>
-        <w:rPr>
-          <w:rFonts w:ascii="Roboto" w:hAnsi="Roboto"/>
-        </w:rPr>
-        <w:t>.enabled</w:t>
-      </w:r>
-      <w:proofErr w:type="spellEnd"/>
-      <w:r>
-        <w:rPr>
-          <w:rFonts w:ascii="Roboto" w:hAnsi="Roboto"/>
-        </w:rPr>
-        <w:t xml:space="preserve"> and </w:t>
-      </w:r>
-      <w:proofErr w:type="spellStart"/>
-      <w:proofErr w:type="gramStart"/>
-      <w:r>
-        <w:rPr>
-          <w:rFonts w:ascii="Roboto" w:hAnsi="Roboto"/>
-        </w:rPr>
-        <w:t>sections.appendices</w:t>
-      </w:r>
-      <w:proofErr w:type="gramEnd"/>
-      <w:r>
-        <w:rPr>
-          <w:rFonts w:ascii="Roboto" w:hAnsi="Roboto"/>
-        </w:rPr>
-        <w:t>.items</w:t>
-      </w:r>
-      <w:proofErr w:type="spellEnd"/>
-      <w:r>
-        <w:rPr>
-          <w:rFonts w:ascii="Roboto" w:hAnsi="Roboto"/>
-        </w:rPr>
-        <w:t xml:space="preserve"> </w:t>
-      </w:r>
-      <w:proofErr w:type="gramStart"/>
-      <w:r>
-        <w:rPr>
-          <w:rFonts w:ascii="Roboto" w:hAnsi="Roboto"/>
-        </w:rPr>
-        <w:t>%}</w:t>
-      </w:r>
       <w:r>
         <w:rPr>
           <w:rFonts w:ascii="Menlo" w:eastAsia="宋体" w:hAnsi="Menlo" w:cs="Menlo"/>
@@ -1503,9 +1218,125 @@
           <w:szCs w:val="28"/>
           <w14:ligatures w14:val="none"/>
         </w:rPr>
-        <w:t>{{ s</w:t>
+        <w:t xml:space="preserve"> }}</w:t>
+      </w:r>
+    </w:p>
+    <w:p>
+      <w:pPr>
+        <w:widowControl/>
+        <w:jc w:val="left"/>
+        <w:rPr>
+          <w:rFonts w:ascii="Roboto" w:hAnsi="Roboto"/>
+        </w:rPr>
+      </w:pPr>
+      <w:r>
+        <w:rPr>
+          <w:rFonts w:ascii="Roboto" w:hAnsi="Roboto"/>
+        </w:rPr>
+        <w:t>{% if sections.required_documents.subdoc %}{{ sections.required_documents.subdoc }}{% else %}{{ sections.required_documents.plain }}{% endif %}</w:t>
+      </w:r>
+    </w:p>
+    <w:p>
+      <w:pPr>
+        <w:widowControl/>
+        <w:jc w:val="left"/>
+        <w:rPr>
+          <w:rFonts w:ascii="Roboto" w:hAnsi="Roboto"/>
+        </w:rPr>
+      </w:pPr>
+      <w:r>
+        <w:rPr>
+          <w:rFonts w:ascii="Roboto" w:hAnsi="Roboto"/>
+        </w:rPr>
+        <w:br w:type="page"/>
+      </w:r>
+    </w:p>
+    <w:p>
+      <w:pPr>
+        <w:widowControl/>
+        <w:jc w:val="left"/>
+        <w:rPr>
+          <w:rFonts w:ascii="Roboto" w:hAnsi="Roboto"/>
+        </w:rPr>
+      </w:pPr>
+      <w:r>
+        <w:rPr>
+          <w:rFonts w:ascii="Roboto" w:hAnsi="Roboto"/>
+        </w:rPr>
+        <w:lastRenderedPageBreak/>
+        <w:t xml:space="preserve">{% endif </w:t>
+      </w:r>
+      <w:proofErr w:type="gramStart"/>
+      <w:r>
+        <w:rPr>
+          <w:rFonts w:ascii="Roboto" w:hAnsi="Roboto"/>
+        </w:rPr>
+        <w:t>%}</w:t>
+      </w:r>
+      <w:r>
+        <w:rPr>
+          <w:rFonts w:ascii="Roboto" w:hAnsi="Roboto"/>
+        </w:rPr>
+        <w:t>{</w:t>
+      </w:r>
+      <w:proofErr w:type="gramEnd"/>
+      <w:r>
+        <w:rPr>
+          <w:rFonts w:ascii="Roboto" w:hAnsi="Roboto"/>
+        </w:rPr>
+        <w:t xml:space="preserve">% if </w:t>
       </w:r>
       <w:proofErr w:type="spellStart"/>
+      <w:proofErr w:type="gramStart"/>
+      <w:r>
+        <w:rPr>
+          <w:rFonts w:ascii="Roboto" w:hAnsi="Roboto"/>
+        </w:rPr>
+        <w:t>sections.appendices</w:t>
+      </w:r>
+      <w:proofErr w:type="gramEnd"/>
+      <w:r>
+        <w:rPr>
+          <w:rFonts w:ascii="Roboto" w:hAnsi="Roboto"/>
+        </w:rPr>
+        <w:t>.enabled</w:t>
+      </w:r>
+      <w:proofErr w:type="spellEnd"/>
+      <w:r>
+        <w:rPr>
+          <w:rFonts w:ascii="Roboto" w:hAnsi="Roboto"/>
+        </w:rPr>
+        <w:t xml:space="preserve"> and </w:t>
+      </w:r>
+      <w:proofErr w:type="spellStart"/>
+      <w:proofErr w:type="gramStart"/>
+      <w:r>
+        <w:rPr>
+          <w:rFonts w:ascii="Roboto" w:hAnsi="Roboto"/>
+        </w:rPr>
+        <w:t>sections.appendices</w:t>
+      </w:r>
+      <w:proofErr w:type="gramEnd"/>
+      <w:r>
+        <w:rPr>
+          <w:rFonts w:ascii="Roboto" w:hAnsi="Roboto"/>
+        </w:rPr>
+        <w:t>.items</w:t>
+      </w:r>
+      <w:proofErr w:type="spellEnd"/>
+      <w:r>
+        <w:rPr>
+          <w:rFonts w:ascii="Roboto" w:hAnsi="Roboto"/>
+        </w:rPr>
+        <w:t xml:space="preserve"> </w:t>
+      </w:r>
+      <w:proofErr w:type="gramStart"/>
+      <w:r>
+        <w:rPr>
+          <w:rFonts w:ascii="Roboto" w:hAnsi="Roboto"/>
+        </w:rPr>
+        <w:t>%}</w:t>
+      </w:r>
       <w:r>
         <w:rPr>
           <w:rFonts w:ascii="Menlo" w:eastAsia="宋体" w:hAnsi="Menlo" w:cs="Menlo"/>
@@ -1517,9 +1348,9 @@
           <w:szCs w:val="28"/>
           <w14:ligatures w14:val="none"/>
         </w:rPr>
-        <w:t>ections</w:t>
-      </w:r>
-      <w:proofErr w:type="gramEnd"/>
+        <w:t xml:space="preserve">{{ </w:t>
+      </w:r>
+      <w:proofErr w:type="spellStart"/>
       <w:r>
         <w:rPr>
           <w:rFonts w:ascii="Menlo" w:eastAsia="宋体" w:hAnsi="Menlo" w:cs="Menlo"/>
@@ -1531,9 +1362,9 @@
           <w:szCs w:val="28"/>
           <w14:ligatures w14:val="none"/>
         </w:rPr>
-        <w:t>.</w:t>
-      </w:r>
-      <w:proofErr w:type="gramStart"/>
+        <w:t>sections</w:t>
+      </w:r>
+      <w:proofErr w:type="gramEnd"/>
       <w:r>
         <w:rPr>
           <w:rFonts w:ascii="Menlo" w:eastAsia="宋体" w:hAnsi="Menlo" w:cs="Menlo"/>
@@ -1545,10 +1376,9 @@
           <w:szCs w:val="28"/>
           <w14:ligatures w14:val="none"/>
         </w:rPr>
-        <w:t>appendices.title</w:t>
-      </w:r>
-      <w:proofErr w:type="spellEnd"/>
-      <w:proofErr w:type="gramEnd"/>
+        <w:t>.</w:t>
+      </w:r>
+      <w:proofErr w:type="gramStart"/>
       <w:r>
         <w:rPr>
           <w:rFonts w:ascii="Menlo" w:eastAsia="宋体" w:hAnsi="Menlo" w:cs="Menlo"/>
@@ -1560,58 +1390,61 @@
           <w:szCs w:val="28"/>
           <w14:ligatures w14:val="none"/>
         </w:rPr>
-        <w:t xml:space="preserve"> }}</w:t>
-      </w:r>
-    </w:p>
-    <w:p>
-      <w:pPr>
-        <w:rPr>
-          <w:rFonts w:ascii="Roboto" w:hAnsi="Roboto"/>
-        </w:rPr>
-      </w:pPr>
-      <w:r>
-        <w:rPr>
-          <w:rFonts w:ascii="Roboto" w:hAnsi="Roboto"/>
-        </w:rPr>
-        <w:t xml:space="preserve">{% for item in </w:t>
-      </w:r>
-      <w:proofErr w:type="spellStart"/>
-      <w:proofErr w:type="gramStart"/>
-      <w:r>
-        <w:rPr>
-          <w:rFonts w:ascii="Roboto" w:hAnsi="Roboto"/>
-        </w:rPr>
-        <w:t>sections.appendices</w:t>
-      </w:r>
+        <w:t>appendices.title</w:t>
+      </w:r>
+      <w:proofErr w:type="spellEnd"/>
       <w:proofErr w:type="gramEnd"/>
       <w:r>
-        <w:rPr>
-          <w:rFonts w:ascii="Roboto" w:hAnsi="Roboto"/>
-        </w:rPr>
-        <w:t>.items</w:t>
-      </w:r>
-      <w:proofErr w:type="spellEnd"/>
-      <w:r>
-        <w:rPr>
-          <w:rFonts w:ascii="Roboto" w:hAnsi="Roboto"/>
-        </w:rPr>
-        <w:t xml:space="preserve"> %}</w:t>
-      </w:r>
-    </w:p>
-    <w:p>
-      <w:pPr>
         <w:rPr>
           <w:rFonts w:ascii="Menlo" w:eastAsia="宋体" w:hAnsi="Menlo" w:cs="Menlo"/>
           <w:b/>
           <w:bCs/>
           <w:color w:val="FF6611"/>
           <w:kern w:val="0"/>
-          <w:sz w:val="24"/>
+          <w:sz w:val="28"/>
+          <w:szCs w:val="28"/>
           <w14:ligatures w14:val="none"/>
         </w:rPr>
-      </w:pPr>
+        <w:t xml:space="preserve"> }}</w:t>
+      </w:r>
+    </w:p>
+    <w:p>
+      <w:pPr>
+        <w:rPr>
+          <w:rFonts w:ascii="Roboto" w:hAnsi="Roboto"/>
+        </w:rPr>
+      </w:pPr>
+      <w:r>
+        <w:rPr>
+          <w:rFonts w:ascii="Roboto" w:hAnsi="Roboto"/>
+        </w:rPr>
+        <w:t xml:space="preserve">{% for item in </w:t>
+      </w:r>
+      <w:proofErr w:type="spellStart"/>
       <w:proofErr w:type="gramStart"/>
       <w:r>
+        <w:rPr>
+          <w:rFonts w:ascii="Roboto" w:hAnsi="Roboto"/>
+        </w:rPr>
+        <w:t>sections.appendices</w:t>
+      </w:r>
+      <w:proofErr w:type="gramEnd"/>
+      <w:r>
+        <w:rPr>
+          <w:rFonts w:ascii="Roboto" w:hAnsi="Roboto"/>
+        </w:rPr>
+        <w:t>.items</w:t>
+      </w:r>
+      <w:proofErr w:type="spellEnd"/>
+      <w:r>
+        <w:rPr>
+          <w:rFonts w:ascii="Roboto" w:hAnsi="Roboto"/>
+        </w:rPr>
+        <w:t xml:space="preserve"> %}</w:t>
+      </w:r>
+    </w:p>
+    <w:p>
+      <w:pPr>
         <w:rPr>
           <w:rFonts w:ascii="Menlo" w:eastAsia="宋体" w:hAnsi="Menlo" w:cs="Menlo"/>
           <w:b/>
@@ -1621,9 +1454,8 @@
           <w:sz w:val="24"/>
           <w14:ligatures w14:val="none"/>
         </w:rPr>
-        <w:t xml:space="preserve">{{ </w:t>
-      </w:r>
-      <w:proofErr w:type="spellStart"/>
+      </w:pPr>
+      <w:proofErr w:type="gramStart"/>
       <w:r>
         <w:rPr>
           <w:rFonts w:ascii="Menlo" w:eastAsia="宋体" w:hAnsi="Menlo" w:cs="Menlo"/>
@@ -1634,9 +1466,9 @@
           <w:sz w:val="24"/>
           <w14:ligatures w14:val="none"/>
         </w:rPr>
-        <w:t>item</w:t>
-      </w:r>
-      <w:proofErr w:type="gramEnd"/>
+        <w:t xml:space="preserve">{{ </w:t>
+      </w:r>
+      <w:proofErr w:type="spellStart"/>
       <w:r>
         <w:rPr>
           <w:rFonts w:ascii="Menlo" w:eastAsia="宋体" w:hAnsi="Menlo" w:cs="Menlo"/>
@@ -1647,9 +1479,9 @@
           <w:sz w:val="24"/>
           <w14:ligatures w14:val="none"/>
         </w:rPr>
-        <w:t>.</w:t>
-      </w:r>
-      <w:proofErr w:type="gramStart"/>
+        <w:t>item</w:t>
+      </w:r>
+      <w:proofErr w:type="gramEnd"/>
       <w:r>
         <w:rPr>
           <w:rFonts w:ascii="Menlo" w:eastAsia="宋体" w:hAnsi="Menlo" w:cs="Menlo"/>
@@ -1660,9 +1492,9 @@
           <w:sz w:val="24"/>
           <w14:ligatures w14:val="none"/>
         </w:rPr>
-        <w:t>title</w:t>
-      </w:r>
-      <w:proofErr w:type="spellEnd"/>
+        <w:t>.</w:t>
+      </w:r>
+      <w:proofErr w:type="gramStart"/>
       <w:r>
         <w:rPr>
           <w:rFonts w:ascii="Menlo" w:eastAsia="宋体" w:hAnsi="Menlo" w:cs="Menlo"/>
@@ -1673,9 +1505,9 @@
           <w:sz w:val="24"/>
           <w14:ligatures w14:val="none"/>
         </w:rPr>
-        <w:t xml:space="preserve"> }</w:t>
-      </w:r>
-      <w:proofErr w:type="gramEnd"/>
+        <w:t>title</w:t>
+      </w:r>
+      <w:proofErr w:type="spellEnd"/>
       <w:r>
         <w:rPr>
           <w:rFonts w:ascii="Menlo" w:eastAsia="宋体" w:hAnsi="Menlo" w:cs="Menlo"/>
@@ -1686,6 +1518,19 @@
           <w:sz w:val="24"/>
           <w14:ligatures w14:val="none"/>
         </w:rPr>
+        <w:t xml:space="preserve"> }</w:t>
+      </w:r>
+      <w:proofErr w:type="gramEnd"/>
+      <w:r>
+        <w:rPr>
+          <w:rFonts w:ascii="Menlo" w:eastAsia="宋体" w:hAnsi="Menlo" w:cs="Menlo"/>
+          <w:b/>
+          <w:bCs/>
+          <w:color w:val="FF6611"/>
+          <w:kern w:val="0"/>
+          <w:sz w:val="24"/>
+          <w14:ligatures w14:val="none"/>
+        </w:rPr>
         <w:t>}</w:t>
       </w:r>
     </w:p>
@@ -1695,47 +1540,11 @@
           <w:rFonts w:ascii="Roboto" w:hAnsi="Roboto"/>
         </w:rPr>
       </w:pPr>
-      <w:proofErr w:type="gramStart"/>
-      <w:r>
-        <w:rPr>
-          <w:rFonts w:ascii="Roboto" w:hAnsi="Roboto"/>
-        </w:rPr>
-        <w:t xml:space="preserve">{{ </w:t>
-      </w:r>
-      <w:proofErr w:type="spellStart"/>
-      <w:r>
-        <w:rPr>
-          <w:rFonts w:ascii="Roboto" w:hAnsi="Roboto"/>
-        </w:rPr>
-        <w:t>item</w:t>
-      </w:r>
-      <w:proofErr w:type="gramEnd"/>
-      <w:r>
-        <w:rPr>
-          <w:rFonts w:ascii="Roboto" w:hAnsi="Roboto"/>
-        </w:rPr>
-        <w:t>.</w:t>
-      </w:r>
-      <w:proofErr w:type="gramStart"/>
-      <w:r>
-        <w:rPr>
-          <w:rFonts w:ascii="Roboto" w:hAnsi="Roboto"/>
-        </w:rPr>
-        <w:t>plain</w:t>
-      </w:r>
-      <w:proofErr w:type="spellEnd"/>
-      <w:r>
-        <w:rPr>
-          <w:rFonts w:ascii="Roboto" w:hAnsi="Roboto"/>
-        </w:rPr>
-        <w:t xml:space="preserve"> }</w:t>
-      </w:r>
-      <w:proofErr w:type="gramEnd"/>
-      <w:r>
-        <w:rPr>
-          <w:rFonts w:ascii="Roboto" w:hAnsi="Roboto"/>
-        </w:rPr>
-        <w:t>}</w:t>
+      <w:r>
+        <w:rPr>
+          <w:rFonts w:ascii="Roboto" w:hAnsi="Roboto"/>
+        </w:rPr>
+        <w:t>{% if item.subdoc %}{{ item.subdoc }}{% else %}{{ item.plain }}{% endif %}</w:t>
       </w:r>
     </w:p>
     <w:p>

</xml_diff>

<commit_message>
Improve chat startup and proposal Section View panel.
Resume the most recently updated chat on load or create one when empty, and hide version/meta in Section View while showing template_id as a subtle header badge.

Co-authored-by: Cursor <cursoragent@cursor.com>
</commit_message>
<xml_diff>
--- a/backend/agents/proposal-composer/knowledge/templates/harneys-bvi/export/proposal.docx
+++ b/backend/agents/proposal-composer/knowledge/templates/harneys-bvi/export/proposal.docx
@@ -551,13 +551,6 @@
         </w:rPr>
         <w:t>}</w:t>
       </w:r>
-    </w:p>
-    <w:p>
-      <w:pPr>
-        <w:rPr>
-          <w:rFonts w:ascii="Roboto" w:hAnsi="Roboto"/>
-        </w:rPr>
-      </w:pPr>
     </w:p>
     <w:tbl>
       <w:tblPr>
@@ -753,23 +746,15 @@
               <w:rPr>
                 <w:rFonts w:ascii="Roboto" w:hAnsi="Roboto"/>
               </w:rPr>
-              <w:t>.amount_</w:t>
-            </w:r>
-            <w:proofErr w:type="gramStart"/>
-            <w:r>
-              <w:rPr>
-                <w:rFonts w:ascii="Roboto" w:hAnsi="Roboto"/>
-              </w:rPr>
-              <w:t>display</w:t>
+              <w:t>.amount_display</w:t>
             </w:r>
             <w:proofErr w:type="spellEnd"/>
             <w:r>
               <w:rPr>
                 <w:rFonts w:ascii="Roboto" w:hAnsi="Roboto"/>
               </w:rPr>
-              <w:t xml:space="preserve"> }}`</w:t>
+              <w:t xml:space="preserve"> }}</w:t>
             </w:r>
-            <w:proofErr w:type="gramEnd"/>
           </w:p>
         </w:tc>
       </w:tr>
@@ -1137,22 +1122,52 @@
           <w:rFonts w:ascii="Roboto" w:hAnsi="Roboto"/>
         </w:rPr>
         <w:lastRenderedPageBreak/>
-        <w:t>{% endif %}</w:t>
-      </w:r>
-      <w:r>
-        <w:rPr>
-          <w:rFonts w:ascii="Roboto" w:hAnsi="Roboto"/>
-        </w:rPr>
-        <w:t xml:space="preserve">{% if </w:t>
+        <w:t xml:space="preserve">{% endif </w:t>
+      </w:r>
+      <w:proofErr w:type="gramStart"/>
+      <w:r>
+        <w:rPr>
+          <w:rFonts w:ascii="Roboto" w:hAnsi="Roboto"/>
+        </w:rPr>
+        <w:t>%}</w:t>
+      </w:r>
+      <w:r>
+        <w:rPr>
+          <w:rFonts w:ascii="Roboto" w:hAnsi="Roboto"/>
+        </w:rPr>
+        <w:t>{</w:t>
+      </w:r>
+      <w:proofErr w:type="gramEnd"/>
+      <w:r>
+        <w:rPr>
+          <w:rFonts w:ascii="Roboto" w:hAnsi="Roboto"/>
+        </w:rPr>
+        <w:t xml:space="preserve">% if </w:t>
       </w:r>
       <w:proofErr w:type="spellStart"/>
-      <w:r>
-        <w:rPr>
-          <w:rFonts w:ascii="Roboto" w:hAnsi="Roboto"/>
-        </w:rPr>
-        <w:t>sections.required_documents.enabled</w:t>
+      <w:proofErr w:type="gramStart"/>
+      <w:r>
+        <w:rPr>
+          <w:rFonts w:ascii="Roboto" w:hAnsi="Roboto"/>
+        </w:rPr>
+        <w:t>sections.required</w:t>
+      </w:r>
+      <w:proofErr w:type="gramEnd"/>
+      <w:r>
+        <w:rPr>
+          <w:rFonts w:ascii="Roboto" w:hAnsi="Roboto"/>
+        </w:rPr>
+        <w:t>_</w:t>
+      </w:r>
+      <w:proofErr w:type="gramStart"/>
+      <w:r>
+        <w:rPr>
+          <w:rFonts w:ascii="Roboto" w:hAnsi="Roboto"/>
+        </w:rPr>
+        <w:t>documents.enabled</w:t>
       </w:r>
       <w:proofErr w:type="spellEnd"/>
+      <w:proofErr w:type="gramEnd"/>
       <w:r>
         <w:rPr>
           <w:rFonts w:ascii="Roboto" w:hAnsi="Roboto"/>
@@ -1177,7 +1192,14 @@
         <w:rPr>
           <w:rFonts w:ascii="Roboto" w:hAnsi="Roboto"/>
         </w:rPr>
-        <w:t xml:space="preserve"> %}</w:t>
+        <w:t xml:space="preserve"> </w:t>
+      </w:r>
+      <w:proofErr w:type="gramStart"/>
+      <w:r>
+        <w:rPr>
+          <w:rFonts w:ascii="Roboto" w:hAnsi="Roboto"/>
+        </w:rPr>
+        <w:t>%}</w:t>
       </w:r>
       <w:r>
         <w:rPr>
@@ -1204,9 +1226,38 @@
           <w:szCs w:val="28"/>
           <w14:ligatures w14:val="none"/>
         </w:rPr>
-        <w:t>sections.required_documents.title</w:t>
+        <w:t>sections</w:t>
+      </w:r>
+      <w:proofErr w:type="gramEnd"/>
+      <w:r>
+        <w:rPr>
+          <w:rFonts w:ascii="Menlo" w:eastAsia="宋体" w:hAnsi="Menlo" w:cs="Menlo"/>
+          <w:b/>
+          <w:bCs/>
+          <w:color w:val="FF6611"/>
+          <w:kern w:val="0"/>
+          <w:sz w:val="28"/>
+          <w:szCs w:val="28"/>
+          <w14:ligatures w14:val="none"/>
+        </w:rPr>
+        <w:t>.required_</w:t>
+      </w:r>
+      <w:proofErr w:type="gramStart"/>
+      <w:r>
+        <w:rPr>
+          <w:rFonts w:ascii="Menlo" w:eastAsia="宋体" w:hAnsi="Menlo" w:cs="Menlo"/>
+          <w:b/>
+          <w:bCs/>
+          <w:color w:val="FF6611"/>
+          <w:kern w:val="0"/>
+          <w:sz w:val="28"/>
+          <w:szCs w:val="28"/>
+          <w14:ligatures w14:val="none"/>
+        </w:rPr>
+        <w:t>documents.title</w:t>
       </w:r>
       <w:proofErr w:type="spellEnd"/>
+      <w:proofErr w:type="gramEnd"/>
       <w:r>
         <w:rPr>
           <w:rFonts w:ascii="Menlo" w:eastAsia="宋体" w:hAnsi="Menlo" w:cs="Menlo"/>
@@ -1544,7 +1595,77 @@
         <w:rPr>
           <w:rFonts w:ascii="Roboto" w:hAnsi="Roboto"/>
         </w:rPr>
-        <w:t>{% if item.subdoc %}{{ item.subdoc }}{% else %}{{ item.plain }}{% endif %}</w:t>
+        <w:t xml:space="preserve">{% if </w:t>
+      </w:r>
+      <w:proofErr w:type="gramStart"/>
+      <w:r>
+        <w:rPr>
+          <w:rFonts w:ascii="Roboto" w:hAnsi="Roboto"/>
+        </w:rPr>
+        <w:t>item.subdoc</w:t>
+      </w:r>
+      <w:proofErr w:type="gramEnd"/>
+      <w:r>
+        <w:rPr>
+          <w:rFonts w:ascii="Roboto" w:hAnsi="Roboto"/>
+        </w:rPr>
+        <w:t xml:space="preserve"> </w:t>
+      </w:r>
+      <w:proofErr w:type="gramStart"/>
+      <w:r>
+        <w:rPr>
+          <w:rFonts w:ascii="Roboto" w:hAnsi="Roboto"/>
+        </w:rPr>
+        <w:t>%}{{ item</w:t>
+      </w:r>
+      <w:proofErr w:type="gramEnd"/>
+      <w:r>
+        <w:rPr>
+          <w:rFonts w:ascii="Roboto" w:hAnsi="Roboto"/>
+        </w:rPr>
+        <w:t>.</w:t>
+      </w:r>
+      <w:proofErr w:type="gramStart"/>
+      <w:r>
+        <w:rPr>
+          <w:rFonts w:ascii="Roboto" w:hAnsi="Roboto"/>
+        </w:rPr>
+        <w:t>subdoc }}{</w:t>
+      </w:r>
+      <w:proofErr w:type="gramEnd"/>
+      <w:r>
+        <w:rPr>
+          <w:rFonts w:ascii="Roboto" w:hAnsi="Roboto"/>
+        </w:rPr>
+        <w:t xml:space="preserve">% else </w:t>
+      </w:r>
+      <w:proofErr w:type="gramStart"/>
+      <w:r>
+        <w:rPr>
+          <w:rFonts w:ascii="Roboto" w:hAnsi="Roboto"/>
+        </w:rPr>
+        <w:t>%}{{ item</w:t>
+      </w:r>
+      <w:proofErr w:type="gramEnd"/>
+      <w:r>
+        <w:rPr>
+          <w:rFonts w:ascii="Roboto" w:hAnsi="Roboto"/>
+        </w:rPr>
+        <w:t>.</w:t>
+      </w:r>
+      <w:proofErr w:type="gramStart"/>
+      <w:r>
+        <w:rPr>
+          <w:rFonts w:ascii="Roboto" w:hAnsi="Roboto"/>
+        </w:rPr>
+        <w:t>plain }}{</w:t>
+      </w:r>
+      <w:proofErr w:type="gramEnd"/>
+      <w:r>
+        <w:rPr>
+          <w:rFonts w:ascii="Roboto" w:hAnsi="Roboto"/>
+        </w:rPr>
+        <w:t>% endif %}</w:t>
       </w:r>
     </w:p>
     <w:p>
@@ -1589,13 +1710,6 @@
         </w:rPr>
         <w:t xml:space="preserve"> %}{% endif %}</w:t>
       </w:r>
-    </w:p>
-    <w:p>
-      <w:pPr>
-        <w:rPr>
-          <w:rFonts w:ascii="Roboto" w:hAnsi="Roboto"/>
-        </w:rPr>
-      </w:pPr>
     </w:p>
     <w:sectPr>
       <w:pgSz w:w="11906" w:h="16838"/>

</xml_diff>